<commit_message>
Fix the Strategic Imperatives timeline wording and date the footer from git
</commit_message>
<xml_diff>
--- a/Marius_Olariu_CV.docx
+++ b/Marius_Olariu_CV.docx
@@ -45,7 +45,7 @@
         <w:pStyle w:val="FirstParagraph"/>
       </w:pPr>
       <w:r>
-        <w:t xml:space="preserve">I work mainly in Java and Spring Boot, and I build the frontend when a feature needs it, lately in TypeScript and Next.js. For over two years I have been at Strategic Imperatives on Elevate, a billing platform that processes around £100M a month for UK telecom resellers. Before that I built checkout services at Vodafone, where I was recognised as Top Talent and promoted to lead a team.</w:t>
+        <w:t xml:space="preserve">I work mainly in Java and Spring Boot, and I build the frontend when a feature needs it, lately in TypeScript and Next.js. For over two years I have been at Strategic Imperatives, most of that on Elevate, a billing platform that processes around £100M a month for UK telecom resellers. Before that I built checkout services at Vodafone, where I was recognised as Top Talent and promoted to lead a team.</w:t>
       </w:r>
     </w:p>
     <w:p>
@@ -242,7 +242,7 @@
         </w:numPr>
       </w:pPr>
       <w:r>
-        <w:t xml:space="preserve">Spent the first two years on the billing team, building rate card, product configuration, invoicing and reporting features for Elevate, which processes roughly £100M of monthly revenue and handles invoices with over a million call records.</w:t>
+        <w:t xml:space="preserve">Spent most of my time there on the billing team, building rate card, product configuration, invoicing and reporting features for Elevate, which processes roughly £100M of monthly revenue and handles invoices with over a million call records.</w:t>
       </w:r>
     </w:p>
     <w:p>

</xml_diff>

<commit_message>
Describe the breadth of Elevate work and the View my Bill project
</commit_message>
<xml_diff>
--- a/Marius_Olariu_CV.docx
+++ b/Marius_Olariu_CV.docx
@@ -242,7 +242,19 @@
         </w:numPr>
       </w:pPr>
       <w:r>
-        <w:t xml:space="preserve">Spent most of my time there on the billing team, building rate card, product configuration, invoicing and reporting features for Elevate, which processes roughly £100M of monthly revenue and handles invoices with over a million call records.</w:t>
+        <w:t xml:space="preserve">Spent most of my time there on the Elevate billing team, working across the codebase: payments, invoicing, the rental engine, the frontend and more. Elevate processes roughly £100M of monthly revenue and handles invoices with over a million call records.</w:t>
+      </w:r>
+    </w:p>
+    <w:p>
+      <w:pPr>
+        <w:pStyle w:val="Compact"/>
+        <w:numPr>
+          <w:ilvl w:val="0"/>
+          <w:numId w:val="1002"/>
+        </w:numPr>
+      </w:pPr>
+      <w:r>
+        <w:t xml:space="preserve">Contributed a good part of the architecture and early direction of View my Bill, a new brownfield project that lets our customers’ own customers download their bills and see their consumption. It pairs a backend-for-frontend over our REST services with a Next.js app as the frontend.</w:t>
       </w:r>
     </w:p>
     <w:p>

</xml_diff>

<commit_message>
Make the CV faster to scan for recruiters and hiring managers
- Title the tab "Marius Olariu CV"; og:title keeps the role for link previews.
- Link each company to its site in a new tab, marked with an arrow and
  announced to screen readers, with a one-line description of what it does.
- Download the CV as an ATS-safe Word file (Arial 10pt, A4, single column,
  linked company names) and drop the PDF and cv.html that only fed it.
- State the work preference: hybrid roles in London.
- Replace "over two years" with "November 2024 – present", which was wrong
  and could not stay right; mark Diffblue and IQVIA as hybrid.
- Back every listed tool with a role: tag MySQL, Liquibase, Karate and Docker
  on Strategic Imperatives and drop Terraform.
- Remove the emoji from technology tags.
- Show "Showing N of 6 roles using X" with a Clear button, pinned to the
  bottom of the viewport, while a technology filter is active.
- Move Technical skills above Soft skills, matching the Word CV.
</commit_message>
<xml_diff>
--- a/Marius_Olariu_CV.docx
+++ b/Marius_Olariu_CV.docx
@@ -2,7 +2,7 @@
 <file path=word/document.xml><?xml version="1.0" encoding="utf-8"?>
 <w:document xmlns:w="http://schemas.openxmlformats.org/wordprocessingml/2006/main" xmlns:m="http://schemas.openxmlformats.org/officeDocument/2006/math" xmlns:r="http://schemas.openxmlformats.org/officeDocument/2006/relationships" xmlns:o="urn:schemas-microsoft-com:office:office" xmlns:v="urn:schemas-microsoft-com:vml" xmlns:w10="urn:schemas-microsoft-com:office:word" xmlns:a="http://schemas.openxmlformats.org/drawingml/2006/main" xmlns:pic="http://schemas.openxmlformats.org/drawingml/2006/picture" xmlns:wp="http://schemas.openxmlformats.org/drawingml/2006/wordprocessingDrawing">
   <w:body>
-    <w:bookmarkStart w:id="20" w:name="marius-olariu"/>
+    <w:bookmarkStart w:id="26" w:name="marius-olariu"/>
     <w:p>
       <w:pPr>
         <w:pStyle w:val="Heading1"/>
@@ -28,7 +28,7 @@
         <w:pStyle w:val="BodyText"/>
       </w:pPr>
       <w:r>
-        <w:t xml:space="preserve">London, UK | Settled status, no sponsorship needed | marius.lucian.olariu@gmail.com | https://www.linkedin.com/in/mlo1994/ | https://github.com/mariusolariu</w:t>
+        <w:t xml:space="preserve">London, UK | Settled status, no sponsorship needed | Prefers hybrid roles in London | marius.lucian.olariu@gmail.com | https://www.linkedin.com/in/mlo1994/ | https://github.com/mariusolariu</w:t>
       </w:r>
     </w:p>
     <w:bookmarkStart w:id="9" w:name="summary"/>
@@ -45,7 +45,7 @@
         <w:pStyle w:val="FirstParagraph"/>
       </w:pPr>
       <w:r>
-        <w:t xml:space="preserve">I work mainly in Java and Spring Boot, and I build the frontend when a feature needs it, lately in TypeScript and Next.js. For over two years I have been at Strategic Imperatives, most of that on Elevate, a billing platform that processes around £100M a month for UK telecom resellers. Before that I built checkout services at Vodafone, where I was recognised as Top Talent and promoted to lead a team.</w:t>
+        <w:t xml:space="preserve">I work mainly in Java and Spring Boot, and I build the frontend when a feature needs it, lately in TypeScript and Next.js. At Strategic Imperatives (November 2024 – present), most of my work has been on Elevate, a billing platform that processes around £100M a month for UK telecom resellers. Before that I built checkout services at Vodafone, where I was recognised as Top Talent and promoted to lead a team.</w:t>
       </w:r>
     </w:p>
     <w:p>
@@ -129,7 +129,7 @@
         <w:t xml:space="preserve"> </w:t>
       </w:r>
       <w:r>
-        <w:t xml:space="preserve">AWS (Lambda, Cognito, S3, SQS), Serverless Framework, Terraform, Docker, CI/CD</w:t>
+        <w:t xml:space="preserve">AWS (Lambda, Cognito, S3, SQS), Serverless Framework, Docker, CI/CD</w:t>
       </w:r>
     </w:p>
     <w:p>
@@ -199,7 +199,7 @@
       </w:r>
     </w:p>
     <w:bookmarkEnd w:id="10"/>
-    <w:bookmarkStart w:id="17" w:name="experience"/>
+    <w:bookmarkStart w:id="23" w:name="experience"/>
     <w:p>
       <w:pPr>
         <w:pStyle w:val="Heading2"/>
@@ -208,21 +208,32 @@
         <w:t xml:space="preserve">Experience</w:t>
       </w:r>
     </w:p>
-    <w:bookmarkStart w:id="11" w:name="X2971d12447196d8b12544a6a4755a49a8f4a1ab"/>
+    <w:bookmarkStart w:id="12" w:name="X2971d12447196d8b12544a6a4755a49a8f4a1ab"/>
     <w:p>
       <w:pPr>
         <w:pStyle w:val="Heading3"/>
       </w:pPr>
       <w:r>
-        <w:t xml:space="preserve">Senior Full-Stack Software Engineer, Strategic Imperatives</w:t>
-      </w:r>
+        <w:t xml:space="preserve">Senior Full-Stack Software Engineer,</w:t>
+      </w:r>
+      <w:r>
+        <w:t xml:space="preserve"> </w:t>
+      </w:r>
+      <w:hyperlink r:id="rId11">
+        <w:r>
+          <w:rPr>
+            <w:rStyle w:val="Hyperlink"/>
+          </w:rPr>
+          <w:t xml:space="preserve">Strategic Imperatives</w:t>
+        </w:r>
+      </w:hyperlink>
     </w:p>
     <w:p>
       <w:pPr>
         <w:pStyle w:val="FirstParagraph"/>
       </w:pPr>
       <w:r>
-        <w:t xml:space="preserve">Woking, hybrid | Nov 2024 – Present (over two years)</w:t>
+        <w:t xml:space="preserve">Cloud billing and fibre platforms for UK telecoms providers | Woking, hybrid | Nov 2024 – Present</w:t>
       </w:r>
     </w:p>
     <w:p>
@@ -230,7 +241,7 @@
         <w:pStyle w:val="BodyText"/>
       </w:pPr>
       <w:r>
-        <w:t xml:space="preserve">Technologies: Java, Spring Boot, AWS, SQL, JUnit, Maven, Git, TypeScript, Next.js, NestJS, Serverless, AI-assisted development</w:t>
+        <w:t xml:space="preserve">Technologies: Java, Spring Boot, AWS, SQL, MySQL, Liquibase, Docker, JUnit, Karate, Maven, Git, TypeScript, Next.js, NestJS, Serverless, AI-assisted development</w:t>
       </w:r>
     </w:p>
     <w:p>
@@ -317,22 +328,33 @@
         <w:t xml:space="preserve">Moved in 2026 to the Fibre team, which had more demand than engineers, at my manager’s request so the same practices could take root there. The stack is TypeScript, Next.js, NestJS, AWS Serverless and event-driven, which builds on the React and Node work from earlier in my career.</w:t>
       </w:r>
     </w:p>
-    <w:bookmarkEnd w:id="11"/>
-    <w:bookmarkStart w:id="12" w:name="X38bb03463ccb78f7ff200d416c7e6a9174c9a23"/>
+    <w:bookmarkEnd w:id="12"/>
+    <w:bookmarkStart w:id="14" w:name="X38bb03463ccb78f7ff200d416c7e6a9174c9a23"/>
     <w:p>
       <w:pPr>
         <w:pStyle w:val="Heading3"/>
       </w:pPr>
       <w:r>
-        <w:t xml:space="preserve">Backend Software Engineer, then Software Team Lead, VodafoneThree</w:t>
-      </w:r>
+        <w:t xml:space="preserve">Backend Software Engineer, then Software Team Lead,</w:t>
+      </w:r>
+      <w:r>
+        <w:t xml:space="preserve"> </w:t>
+      </w:r>
+      <w:hyperlink r:id="rId13">
+        <w:r>
+          <w:rPr>
+            <w:rStyle w:val="Hyperlink"/>
+          </w:rPr>
+          <w:t xml:space="preserve">VodafoneThree</w:t>
+        </w:r>
+      </w:hyperlink>
     </w:p>
     <w:p>
       <w:pPr>
         <w:pStyle w:val="FirstParagraph"/>
       </w:pPr>
       <w:r>
-        <w:t xml:space="preserve">London, hybrid | Feb 2023 – Jul 2024</w:t>
+        <w:t xml:space="preserve">UK mobile and broadband network operator | London, hybrid | Feb 2023 – Jul 2024</w:t>
       </w:r>
     </w:p>
     <w:p>
@@ -423,22 +445,33 @@
         <w:t xml:space="preserve">Left for a senior engineering role on a larger-scale platform.</w:t>
       </w:r>
     </w:p>
-    <w:bookmarkEnd w:id="12"/>
-    <w:bookmarkStart w:id="13" w:name="full-stack-software-engineer-iqvia"/>
+    <w:bookmarkEnd w:id="14"/>
+    <w:bookmarkStart w:id="16" w:name="full-stack-software-engineer-iqvia"/>
     <w:p>
       <w:pPr>
         <w:pStyle w:val="Heading3"/>
       </w:pPr>
       <w:r>
-        <w:t xml:space="preserve">Full-Stack Software Engineer, IQVIA</w:t>
-      </w:r>
+        <w:t xml:space="preserve">Full-Stack Software Engineer,</w:t>
+      </w:r>
+      <w:r>
+        <w:t xml:space="preserve"> </w:t>
+      </w:r>
+      <w:hyperlink r:id="rId15">
+        <w:r>
+          <w:rPr>
+            <w:rStyle w:val="Hyperlink"/>
+          </w:rPr>
+          <w:t xml:space="preserve">IQVIA</w:t>
+        </w:r>
+      </w:hyperlink>
     </w:p>
     <w:p>
       <w:pPr>
         <w:pStyle w:val="FirstParagraph"/>
       </w:pPr>
       <w:r>
-        <w:t xml:space="preserve">London | Feb 2022 – Oct 2022</w:t>
+        <w:t xml:space="preserve">Clinical research and health-data company | London, hybrid | Feb 2022 – Oct 2022</w:t>
       </w:r>
     </w:p>
     <w:p>
@@ -485,22 +518,33 @@
         <w:t xml:space="preserve">Left a legacy stack for a modern Java microservices team.</w:t>
       </w:r>
     </w:p>
-    <w:bookmarkEnd w:id="13"/>
-    <w:bookmarkStart w:id="14" w:name="software-engineer-diffblue"/>
+    <w:bookmarkEnd w:id="16"/>
+    <w:bookmarkStart w:id="18" w:name="software-engineer-diffblue"/>
     <w:p>
       <w:pPr>
         <w:pStyle w:val="Heading3"/>
       </w:pPr>
       <w:r>
-        <w:t xml:space="preserve">Software Engineer, Diffblue</w:t>
-      </w:r>
+        <w:t xml:space="preserve">Software Engineer,</w:t>
+      </w:r>
+      <w:r>
+        <w:t xml:space="preserve"> </w:t>
+      </w:r>
+      <w:hyperlink r:id="rId17">
+        <w:r>
+          <w:rPr>
+            <w:rStyle w:val="Hyperlink"/>
+          </w:rPr>
+          <w:t xml:space="preserve">Diffblue</w:t>
+        </w:r>
+      </w:hyperlink>
     </w:p>
     <w:p>
       <w:pPr>
         <w:pStyle w:val="FirstParagraph"/>
       </w:pPr>
       <w:r>
-        <w:t xml:space="preserve">Oxford | Aug 2020 – Feb 2022</w:t>
+        <w:t xml:space="preserve">AI tool that writes unit tests for Java code | Oxford, hybrid | Aug 2020 – Feb 2022</w:t>
       </w:r>
     </w:p>
     <w:p>
@@ -547,22 +591,33 @@
         <w:t xml:space="preserve">Relocated to London and wanted to build user-facing systems again.</w:t>
       </w:r>
     </w:p>
-    <w:bookmarkEnd w:id="14"/>
-    <w:bookmarkStart w:id="15" w:name="Xa09e10a9d55d02f0e20d534713c9b567d9093d4"/>
+    <w:bookmarkEnd w:id="18"/>
+    <w:bookmarkStart w:id="20" w:name="Xa09e10a9d55d02f0e20d534713c9b567d9093d4"/>
     <w:p>
       <w:pPr>
         <w:pStyle w:val="Heading3"/>
       </w:pPr>
       <w:r>
-        <w:t xml:space="preserve">Junior Full-Stack Software Engineer, New Verve Consulting</w:t>
-      </w:r>
+        <w:t xml:space="preserve">Junior Full-Stack Software Engineer,</w:t>
+      </w:r>
+      <w:r>
+        <w:t xml:space="preserve"> </w:t>
+      </w:r>
+      <w:hyperlink r:id="rId19">
+        <w:r>
+          <w:rPr>
+            <w:rStyle w:val="Hyperlink"/>
+          </w:rPr>
+          <w:t xml:space="preserve">New Verve Consulting</w:t>
+        </w:r>
+      </w:hyperlink>
     </w:p>
     <w:p>
       <w:pPr>
         <w:pStyle w:val="FirstParagraph"/>
       </w:pPr>
       <w:r>
-        <w:t xml:space="preserve">Glasgow | Aug 2019 – Aug 2020</w:t>
+        <w:t xml:space="preserve">Atlassian partner consultancy (Jira and Confluence) | Glasgow | Aug 2019 – Aug 2020</w:t>
       </w:r>
     </w:p>
     <w:p>
@@ -609,22 +664,33 @@
         <w:t xml:space="preserve">Relocated to Oxford and took a Java role on a product applying reinforcement learning to test generation.</w:t>
       </w:r>
     </w:p>
-    <w:bookmarkEnd w:id="15"/>
-    <w:bookmarkStart w:id="16" w:name="junior-software-engineer-ssi-schäfer"/>
+    <w:bookmarkEnd w:id="20"/>
+    <w:bookmarkStart w:id="22" w:name="junior-software-engineer-ssi-schäfer"/>
     <w:p>
       <w:pPr>
         <w:pStyle w:val="Heading3"/>
       </w:pPr>
       <w:r>
-        <w:t xml:space="preserve">Junior Software Engineer, SSI Schäfer</w:t>
-      </w:r>
+        <w:t xml:space="preserve">Junior Software Engineer,</w:t>
+      </w:r>
+      <w:r>
+        <w:t xml:space="preserve"> </w:t>
+      </w:r>
+      <w:hyperlink r:id="rId21">
+        <w:r>
+          <w:rPr>
+            <w:rStyle w:val="Hyperlink"/>
+          </w:rPr>
+          <w:t xml:space="preserve">SSI Schäfer</w:t>
+        </w:r>
+      </w:hyperlink>
     </w:p>
     <w:p>
       <w:pPr>
         <w:pStyle w:val="FirstParagraph"/>
       </w:pPr>
       <w:r>
-        <w:t xml:space="preserve">Timișoara, Romania | Sep 2017 – Aug 2018</w:t>
+        <w:t xml:space="preserve">Warehouse automation and storage systems | Timișoara, Romania | Sep 2017 – Aug 2018</w:t>
       </w:r>
     </w:p>
     <w:p>
@@ -659,9 +725,9 @@
         <w:t xml:space="preserve">Moved to Scotland for an MSc.</w:t>
       </w:r>
     </w:p>
-    <w:bookmarkEnd w:id="16"/>
-    <w:bookmarkEnd w:id="17"/>
-    <w:bookmarkStart w:id="18" w:name="soft-skills"/>
+    <w:bookmarkEnd w:id="22"/>
+    <w:bookmarkEnd w:id="23"/>
+    <w:bookmarkStart w:id="24" w:name="soft-skills"/>
     <w:p>
       <w:pPr>
         <w:pStyle w:val="Heading2"/>
@@ -802,8 +868,8 @@
         <w:t xml:space="preserve">Built the team’s environment and deployment tooling without being asked. At home I keep the same habit with Hammerspoon, Karabiner and chezmoi-managed dotfiles.</w:t>
       </w:r>
     </w:p>
-    <w:bookmarkEnd w:id="18"/>
-    <w:bookmarkStart w:id="19" w:name="education"/>
+    <w:bookmarkEnd w:id="24"/>
+    <w:bookmarkStart w:id="25" w:name="education"/>
     <w:p>
       <w:pPr>
         <w:pStyle w:val="Heading2"/>
@@ -884,12 +950,14 @@
         <w:t xml:space="preserve">Languages: English (native or bilingual), Romanian (native or bilingual)</w:t>
       </w:r>
     </w:p>
-    <w:bookmarkEnd w:id="19"/>
-    <w:bookmarkEnd w:id="20"/>
+    <w:bookmarkEnd w:id="25"/>
+    <w:bookmarkEnd w:id="26"/>
     <w:sectPr>
       <w:footnotePr>
         <w:numRestart w:val="eachSect"/>
       </w:footnotePr>
+      <w:pgSz w:h="16838" w:w="11906"/>
+      <w:pgMar w:bottom="850" w:footer="0" w:gutter="0" w:header="0" w:left="850" w:right="850" w:top="850"/>
     </w:sectPr>
   </w:body>
 </w:document>
@@ -1137,15 +1205,15 @@
   <w:docDefaults>
     <w:rPrDefault>
       <w:rPr>
-        <w:rFonts w:asciiTheme="minorHAnsi" w:cstheme="minorBidi" w:eastAsiaTheme="minorEastAsia" w:hAnsiTheme="minorHAnsi"/>
-        <w:sz w:val="24"/>
-        <w:szCs w:val="24"/>
-        <w:lang w:bidi="ar-SA" w:eastAsia="zh-CN" w:val="en-US"/>
+        <w:rFonts w:ascii="Arial" w:cs="Arial" w:eastAsia="Arial" w:hAnsi="Arial"/>
+        <w:sz w:val="20"/>
+        <w:szCs w:val="20"/>
+        <w:lang w:bidi="ar-SA" w:eastAsia="en-GB" w:val="en-GB"/>
       </w:rPr>
     </w:rPrDefault>
     <w:pPrDefault>
       <w:pPr>
-        <w:spacing w:after="200"/>
+        <w:spacing w:after="0" w:line="240" w:lineRule="auto"/>
       </w:pPr>
     </w:pPrDefault>
   </w:docDefaults>
@@ -1160,7 +1228,7 @@
     <w:link w:val="BodyTextChar"/>
     <w:qFormat/>
     <w:pPr>
-      <w:spacing w:after="180" w:before="180"/>
+      <w:spacing w:after="60" w:before="0"/>
     </w:pPr>
   </w:style>
   <w:style w:customStyle="1" w:styleId="FirstParagraph" w:type="paragraph">
@@ -1174,7 +1242,7 @@
     <w:basedOn w:val="BodyText"/>
     <w:qFormat/>
     <w:pPr>
-      <w:spacing w:after="36" w:before="36"/>
+      <w:spacing w:after="20" w:before="0"/>
     </w:pPr>
   </w:style>
   <w:style w:styleId="Title" w:type="paragraph">
@@ -1321,14 +1389,16 @@
     <w:pPr>
       <w:keepNext/>
       <w:keepLines/>
-      <w:spacing w:after="80" w:before="360"/>
+      <w:spacing w:after="20" w:before="0"/>
       <w:outlineLvl w:val="0"/>
     </w:pPr>
     <w:rPr>
-      <w:rFonts w:asciiTheme="majorHAnsi" w:cstheme="majorBidi" w:eastAsiaTheme="majorEastAsia" w:hAnsiTheme="majorHAnsi"/>
-      <w:color w:themeColor="accent1" w:themeShade="BF" w:val="0F4761"/>
-      <w:sz w:val="40"/>
-      <w:szCs w:val="40"/>
+      <w:rFonts w:ascii="Arial" w:cs="Arial" w:eastAsia="Arial" w:hAnsi="Arial"/>
+      <w:b/>
+      <w:bCs/>
+      <w:color w:val="000000"/>
+      <w:sz w:val="36"/>
+      <w:szCs w:val="36"/>
     </w:rPr>
   </w:style>
   <w:style w:styleId="Heading2" w:type="paragraph">
@@ -1344,14 +1414,19 @@
     <w:pPr>
       <w:keepNext/>
       <w:keepLines/>
-      <w:spacing w:after="80" w:before="160"/>
+      <w:pBdr>
+        <w:bottom w:color="000000" w:space="1" w:sz="6" w:val="single"/>
+      </w:pBdr>
+      <w:spacing w:after="60" w:before="180"/>
       <w:outlineLvl w:val="1"/>
     </w:pPr>
     <w:rPr>
-      <w:rFonts w:asciiTheme="majorHAnsi" w:cstheme="majorBidi" w:eastAsiaTheme="majorEastAsia" w:hAnsiTheme="majorHAnsi"/>
-      <w:color w:themeColor="accent1" w:themeShade="BF" w:val="0F4761"/>
-      <w:sz w:val="32"/>
-      <w:szCs w:val="32"/>
+      <w:rFonts w:ascii="Arial" w:cs="Arial" w:eastAsia="Arial" w:hAnsi="Arial"/>
+      <w:b/>
+      <w:bCs/>
+      <w:color w:val="000000"/>
+      <w:sz w:val="24"/>
+      <w:szCs w:val="24"/>
     </w:rPr>
   </w:style>
   <w:style w:styleId="Heading3" w:type="paragraph">
@@ -1367,14 +1442,16 @@
     <w:pPr>
       <w:keepNext/>
       <w:keepLines/>
-      <w:spacing w:after="80" w:before="160"/>
+      <w:spacing w:after="20" w:before="120"/>
       <w:outlineLvl w:val="2"/>
     </w:pPr>
     <w:rPr>
-      <w:rFonts w:cstheme="majorBidi" w:eastAsiaTheme="majorEastAsia"/>
-      <w:color w:themeColor="accent1" w:themeShade="BF" w:val="0F4761"/>
-      <w:sz w:val="28"/>
-      <w:szCs w:val="28"/>
+      <w:rFonts w:ascii="Arial" w:cs="Arial" w:eastAsia="Arial" w:hAnsi="Arial"/>
+      <w:b/>
+      <w:bCs/>
+      <w:color w:val="000000"/>
+      <w:sz w:val="21"/>
+      <w:szCs w:val="21"/>
     </w:rPr>
   </w:style>
   <w:style w:styleId="Heading4" w:type="paragraph">
@@ -1767,7 +1844,8 @@
     <w:name w:val="Hyperlink"/>
     <w:basedOn w:val="BodyTextChar"/>
     <w:rPr>
-      <w:color w:themeColor="accent1" w:val="4F81BD"/>
+      <w:color w:val="1F3A52"/>
+      <w:u w:val="single"/>
     </w:rPr>
   </w:style>
   <w:style w:styleId="TOCHeading" w:type="paragraph">

</xml_diff>

<commit_message>
Rework soft skills wording: SI context, AI Champion, New Verve coaching, YMCA Paisley, lifelong learner
</commit_message>
<xml_diff>
--- a/Marius_Olariu_CV.docx
+++ b/Marius_Olariu_CV.docx
@@ -649,7 +649,7 @@
         <w:t xml:space="preserve"> </w:t>
       </w:r>
       <w:r>
-        <w:t xml:space="preserve">Main contributor to the cross-team upskilling channel; mentored juniors and other colleagues less experienced than me.</w:t>
+        <w:t xml:space="preserve">Main contributor to the cross-team upskilling channel at Strategic Imperatives; mentored juniors and other colleagues less experienced than me.</w:t>
       </w:r>
     </w:p>
     <w:p>
@@ -671,7 +671,7 @@
         <w:t xml:space="preserve"> </w:t>
       </w:r>
       <w:r>
-        <w:t xml:space="preserve">A talk on developer productivity tools at Diffblue that surprised even the most senior engineers; a talk on ten use cases for AI at Vodafone; two talks on AI-assisted development at Strategic Imperatives, which with other contributions earned the AI Champion award.</w:t>
+        <w:t xml:space="preserve">A talk on developer productivity tools at Diffblue that surprised even the most senior engineers; a talk on ten use cases for AI at Vodafone; two talks on AI-assisted development at Strategic Imperatives, which with other contributions earned me the AI Champion award.</w:t>
       </w:r>
     </w:p>
     <w:p>
@@ -715,7 +715,7 @@
         <w:t xml:space="preserve"> </w:t>
       </w:r>
       <w:r>
-        <w:t xml:space="preserve">Coached a consultant into a developer role; taught coding to 7 to 18 year olds at YMCA Scotland for a year.</w:t>
+        <w:t xml:space="preserve">Coached a technical consultant and helped him to transition into the software developer role while at New Verve Consulting; taught coding to 7 to 18 year olds at YMCA Paisley for a year.</w:t>
       </w:r>
     </w:p>
     <w:p>
@@ -737,7 +737,7 @@
         <w:t xml:space="preserve"> </w:t>
       </w:r>
       <w:r>
-        <w:t xml:space="preserve">Each of those talks came from studying in my own time: the Oxford Saïd Senior Leadership Executive Programme in 2024, two Erasmus semesters, and a new TypeScript and Next.js stack in 2026.</w:t>
+        <w:t xml:space="preserve">Each of the talks above came from studying in my own time, which I like to do; I enjoy being a lifelong learner. Examples: the Oxford Saïd Senior Leadership Executive Programme in 2024, two Erasmus semesters in Sweden and the Netherlands, and a master’s in Scotland. I have studied in several countries to immerse myself in different school systems.</w:t>
       </w:r>
     </w:p>
     <w:p>
@@ -759,7 +759,7 @@
         <w:t xml:space="preserve"> </w:t>
       </w:r>
       <w:r>
-        <w:t xml:space="preserve">Built the team’s environment and deployment tooling without being asked. I constantly automate my own ways of working, and AI has been a godsend for that.</w:t>
+        <w:t xml:space="preserve">Built the team’s environment and deployment tooling at Strategic Imperatives without being asked. I constantly automate my own ways of working and like to share those automations with the team; AI has been a godsend for that.</w:t>
       </w:r>
     </w:p>
     <w:bookmarkEnd w:id="24"/>
@@ -829,7 +829,7 @@
         </w:numPr>
       </w:pPr>
       <w:r>
-        <w:t xml:space="preserve">Coding Mentor, YMCA Scotland, Sep 2018 – Aug 2019. Taught coding to young people aged 7 to 18 in Paisley.</w:t>
+        <w:t xml:space="preserve">Coding Mentor, YMCA Paisley, Sep 2018 – Aug 2019. Taught coding to young people aged 7 to 18 in Paisley.</w:t>
       </w:r>
     </w:p>
     <w:bookmarkEnd w:id="25"/>

</xml_diff>

<commit_message>
Label the hero highlight, drop the quote styling, link it to the Strategic Imperatives role, remove it from the CV summary
</commit_message>
<xml_diff>
--- a/Marius_Olariu_CV.docx
+++ b/Marius_Olariu_CV.docx
@@ -46,14 +46,6 @@
       </w:pPr>
       <w:r>
         <w:t xml:space="preserve">I specialise in backend software development with Java, Spring and AWS; I am also familiar with frontend development using TypeScript, React and Next.js. At Strategic Imperatives (November 2024 – present), most of my work has been on Elevate, a billing platform that processes around £100M a month for UK telecom resellers. Before that I worked in the Checkout team at Vodafone, where through constant effort and dedication I earned the Vodafone Top Talent award.</w:t>
-      </w:r>
-    </w:p>
-    <w:p>
-      <w:pPr>
-        <w:pStyle w:val="BodyText"/>
-      </w:pPr>
-      <w:r>
-        <w:t xml:space="preserve">I share what I learn: talks on AI-assisted development at Vodafone and at Strategic Imperatives, where I led the billing team’s adoption of it. Story throughput at least doubled, no production incident was attributed to it, and I received the company’s AI Champion award.</w:t>
       </w:r>
     </w:p>
     <w:bookmarkEnd w:id="9"/>

</xml_diff>

<commit_message>
State the work pattern for New Verve (full-time, on site) and SSI Schäfer (part-time, on site)
</commit_message>
<xml_diff>
--- a/Marius_Olariu_CV.docx
+++ b/Marius_Olariu_CV.docx
@@ -527,7 +527,7 @@
         <w:pStyle w:val="FirstParagraph"/>
       </w:pPr>
       <w:r>
-        <w:t xml:space="preserve">Atlassian partner consultancy (Jira and Confluence) | Glasgow | Aug 2019 – Aug 2020</w:t>
+        <w:t xml:space="preserve">Atlassian partner consultancy (Jira and Confluence) | Glasgow, on site, full-time | Aug 2019 – Aug 2020</w:t>
       </w:r>
     </w:p>
     <w:p>
@@ -588,7 +588,7 @@
         <w:pStyle w:val="FirstParagraph"/>
       </w:pPr>
       <w:r>
-        <w:t xml:space="preserve">Warehouse automation and storage systems | Timișoara, Romania | Sep 2017 – Aug 2018</w:t>
+        <w:t xml:space="preserve">Warehouse automation and storage systems | Timișoara, Romania, on site, part-time | Sep 2017 – Aug 2018</w:t>
       </w:r>
     </w:p>
     <w:p>

</xml_diff>

<commit_message>
Add a closing reason-for-leaving bullet to five jobs and use recognised in the Diffblue bullet
</commit_message>
<xml_diff>
--- a/Marius_Olariu_CV.docx
+++ b/Marius_Olariu_CV.docx
@@ -379,6 +379,18 @@
         <w:t xml:space="preserve">Recognised as Top Talent, one of four from about 80 engineers, while still a mid-level developer, and promoted to lead a team of seven: five developers, a tester and a scrum master.</w:t>
       </w:r>
     </w:p>
+    <w:p>
+      <w:pPr>
+        <w:pStyle w:val="Compact"/>
+        <w:numPr>
+          <w:ilvl w:val="0"/>
+          <w:numId w:val="1003"/>
+        </w:numPr>
+      </w:pPr>
+      <w:r>
+        <w:t xml:space="preserve">After a short spell in a developer and management role, I realised that management is not the branch of software engineering I want to pursue long term. I returned to an individual-contributor developer role and moved to Strategic Imperatives.</w:t>
+      </w:r>
+    </w:p>
     <w:bookmarkEnd w:id="14"/>
     <w:bookmarkStart w:id="16" w:name="full-stack-software-engineer-iqvia"/>
     <w:p>
@@ -440,6 +452,18 @@
         <w:t xml:space="preserve">Often provided third-line support for UK customers single-handedly in the UK morning, as most of the team was US-based and online from about 4pm. Unblocking large clinical sites, where studies with tens of patients were under way and a quick fix mattered, was the most rewarding part of the role.</w:t>
       </w:r>
     </w:p>
+    <w:p>
+      <w:pPr>
+        <w:pStyle w:val="Compact"/>
+        <w:numPr>
+          <w:ilvl w:val="0"/>
+          <w:numId w:val="1004"/>
+        </w:numPr>
+      </w:pPr>
+      <w:r>
+        <w:t xml:space="preserve">A short stint: the project was a legacy but successful one built on dated technologies (Groovy and Grails), and as the only developer based in the UK I was usually the only developer online, which left little room for career growth or collaboration with other programmers.</w:t>
+      </w:r>
+    </w:p>
     <w:bookmarkEnd w:id="16"/>
     <w:bookmarkStart w:id="18" w:name="software-engineer-diffblue"/>
     <w:p>
@@ -498,7 +522,19 @@
         </w:numPr>
       </w:pPr>
       <w:r>
-        <w:t xml:space="preserve">My tech lead, who saw my potential, had me run some of the stand-ups and retrospectives. I made the most of colleagues from computer-science academia and spent a lot of time, online and offline, learning from them.</w:t>
+        <w:t xml:space="preserve">My tech lead, who recognised my potential, had me run some of the stand-ups and retrospectives. I made the most of colleagues from computer-science academia and spent a lot of time, online and offline, learning from them.</w:t>
+      </w:r>
+    </w:p>
+    <w:p>
+      <w:pPr>
+        <w:pStyle w:val="Compact"/>
+        <w:numPr>
+          <w:ilvl w:val="0"/>
+          <w:numId w:val="1005"/>
+        </w:numPr>
+      </w:pPr>
+      <w:r>
+        <w:t xml:space="preserve">Left when my partner and I decided to move to London, where we bought our first home. I commuted to Oxford weekly, which soon proved costly and time-demanding.</w:t>
       </w:r>
     </w:p>
     <w:bookmarkEnd w:id="18"/>
@@ -562,6 +598,18 @@
         <w:t xml:space="preserve">Mentored a technical consultant into a developer role.</w:t>
       </w:r>
     </w:p>
+    <w:p>
+      <w:pPr>
+        <w:pStyle w:val="Compact"/>
+        <w:numPr>
+          <w:ilvl w:val="0"/>
+          <w:numId w:val="1006"/>
+        </w:numPr>
+      </w:pPr>
+      <w:r>
+        <w:t xml:space="preserve">Left when my partner secured a job in Oxford and we decided to move there; commuting to Glasgow three days a week to the office proved expensive and time-consuming.</w:t>
+      </w:r>
+    </w:p>
     <w:bookmarkEnd w:id="20"/>
     <w:bookmarkStart w:id="22" w:name="junior-software-engineer-ssi-schäfer"/>
     <w:p>
@@ -609,6 +657,18 @@
       </w:pPr>
       <w:r>
         <w:t xml:space="preserve">Contributed to the development of the Java control software for a vertical lift warehouse module, in parallel with the final year of my BSc.</w:t>
+      </w:r>
+    </w:p>
+    <w:p>
+      <w:pPr>
+        <w:pStyle w:val="Compact"/>
+        <w:numPr>
+          <w:ilvl w:val="0"/>
+          <w:numId w:val="1007"/>
+        </w:numPr>
+      </w:pPr>
+      <w:r>
+        <w:t xml:space="preserve">Left to pursue a master’s degree in Mobile and Web Development at the University of the West of Scotland.</w:t>
       </w:r>
     </w:p>
     <w:bookmarkEnd w:id="22"/>

</xml_diff>

<commit_message>
Keep the Word CV in sync with the site and within two pages
npm run cv now rebuilds before running pandoc, so the .docx can no longer
be generated from a stale cv.md (which left "a promotion to Team Lead" in
the Word CV). It then counts pages with headless LibreOffice and fails over
two. A new test fails when the committed .docx differs from a fresh build,
and CI installs pandoc to run it.

To fit two pages: trim the soft-skill evidence to one short line each,
shorten the older reason-for-leaving bullets, and leave the YMCA volunteer
line out of the CV (the Mentor soft skill already covers it).
</commit_message>
<xml_diff>
--- a/Marius_Olariu_CV.docx
+++ b/Marius_Olariu_CV.docx
@@ -45,7 +45,7 @@
         <w:pStyle w:val="FirstParagraph"/>
       </w:pPr>
       <w:r>
-        <w:t xml:space="preserve">I specialise in backend software development with Java, Spring and AWS; I am also familiar with frontend development using TypeScript, React and Next.js. At Strategic Imperatives (November 2024 – present), most of my work has been on Elevate, a billing platform that processes around £100M a month for UK telecom resellers. Before that I worked in the Checkout team at Vodafone, where through constant effort and dedication I earned the Vodafone Top Talent award and a promotion to Team Lead. I have used AI in my daily engineering practice since 2023 and have given talks on it at Vodafone and at Strategic Imperatives, where my talks and being the main contributor to the internal knowledge-sharing channel earned me the AI Champion award. I keep learning and sharing the latest developments.</w:t>
+        <w:t xml:space="preserve">I specialise in backend software development with Java, Spring and AWS; I am also familiar with frontend development using TypeScript, React and Next.js. At Strategic Imperatives (November 2024 – present), most of my work has been on Elevate, a billing platform that processes around £100M a month for UK telecom resellers. Before that I worked in the Checkout team at Vodafone, where through constant effort and dedication I earned the Vodafone Top Talent award. I have used AI in my daily engineering practice since 2023 and have given talks on it at Vodafone and at Strategic Imperatives, where my talks and being the main contributor to the internal knowledge-sharing channel earned me the AI Champion award. I keep learning and sharing the latest developments.</w:t>
       </w:r>
     </w:p>
     <w:bookmarkEnd w:id="9"/>
@@ -461,7 +461,7 @@
         </w:numPr>
       </w:pPr>
       <w:r>
-        <w:t xml:space="preserve">A short stint: the project was a legacy but successful one built on dated technologies (Groovy and Grails), and as the only developer based in the UK I was usually the only developer online, which left little room for career growth or collaboration with other programmers.</w:t>
+        <w:t xml:space="preserve">A short stint: the project was a legacy but successful one on dated technologies, with little room to grow.</w:t>
       </w:r>
     </w:p>
     <w:bookmarkEnd w:id="16"/>
@@ -534,7 +534,7 @@
         </w:numPr>
       </w:pPr>
       <w:r>
-        <w:t xml:space="preserve">Left when my partner and I decided to move to London, where we bought our first home. I commuted to Oxford weekly, which soon proved costly and time-demanding.</w:t>
+        <w:t xml:space="preserve">Left when my partner and I decided to move to London; the weekly commute to Oxford proved costly.</w:t>
       </w:r>
     </w:p>
     <w:bookmarkEnd w:id="18"/>
@@ -607,7 +607,7 @@
         </w:numPr>
       </w:pPr>
       <w:r>
-        <w:t xml:space="preserve">Left when my partner secured a job in Oxford and we decided to move there; commuting to Glasgow three days a week to the office proved expensive and time-consuming.</w:t>
+        <w:t xml:space="preserve">Left when my partner secured a job in Oxford and we decided to move there.</w:t>
       </w:r>
     </w:p>
     <w:bookmarkEnd w:id="20"/>
@@ -668,7 +668,7 @@
         </w:numPr>
       </w:pPr>
       <w:r>
-        <w:t xml:space="preserve">Left to pursue a master’s degree in Mobile and Web Development at the University of the West of Scotland.</w:t>
+        <w:t xml:space="preserve">Left to pursue a master’s degree in Mobile and Web Development in Scotland.</w:t>
       </w:r>
     </w:p>
     <w:bookmarkEnd w:id="22"/>
@@ -701,7 +701,7 @@
         <w:t xml:space="preserve"> </w:t>
       </w:r>
       <w:r>
-        <w:t xml:space="preserve">Main contributor to the cross-team upskilling channel at Strategic Imperatives; mentored juniors and other colleagues less experienced than me.</w:t>
+        <w:t xml:space="preserve">Main contributor to the cross-team upskilling channel at Strategic Imperatives.</w:t>
       </w:r>
     </w:p>
     <w:p>
@@ -723,7 +723,7 @@
         <w:t xml:space="preserve"> </w:t>
       </w:r>
       <w:r>
-        <w:t xml:space="preserve">A talk on developer productivity tools at Diffblue that surprised even the most senior engineers; a talk on ten use cases for AI at Vodafone; two talks on AI-assisted development at Strategic Imperatives, which with other contributions earned me the AI Champion award.</w:t>
+        <w:t xml:space="preserve">Talks on developer productivity at Diffblue, AI use cases at Vodafone and AI-assisted development at Strategic Imperatives, which earned me the AI Champion award.</w:t>
       </w:r>
     </w:p>
     <w:p>
@@ -745,7 +745,7 @@
         <w:t xml:space="preserve"> </w:t>
       </w:r>
       <w:r>
-        <w:t xml:space="preserve">I get on with the people I work with, and I have been trusted to mentor and to run ceremonies since early in my career.</w:t>
+        <w:t xml:space="preserve">Get on well with colleagues; trusted to mentor and run ceremonies from early on.</w:t>
       </w:r>
     </w:p>
     <w:p>
@@ -767,7 +767,7 @@
         <w:t xml:space="preserve"> </w:t>
       </w:r>
       <w:r>
-        <w:t xml:space="preserve">Coached a technical consultant and helped him to transition into the software developer role while at New Verve Consulting; taught coding to 7 to 18 year olds at YMCA Paisley for a year.</w:t>
+        <w:t xml:space="preserve">Coached a technical consultant into a developer role at New Verve Consulting; taught coding to 7 to 18 year olds at YMCA Paisley.</w:t>
       </w:r>
     </w:p>
     <w:p>
@@ -789,7 +789,7 @@
         <w:t xml:space="preserve"> </w:t>
       </w:r>
       <w:r>
-        <w:t xml:space="preserve">Each of the talks above came from studying in my own time, which I like to do; I enjoy being a lifelong learner. Examples: the Oxford Saïd Senior Leadership Executive Programme in 2024, two Erasmus semesters in Sweden and the Netherlands, and a master’s in Scotland. I have studied in several countries to immerse myself in different school systems.</w:t>
+        <w:t xml:space="preserve">A lifelong learner: the Oxford Saïd Senior Leadership Executive Programme (2024), Erasmus semesters in Sweden and the Netherlands, and a master’s in Scotland.</w:t>
       </w:r>
     </w:p>
     <w:p>
@@ -811,7 +811,7 @@
         <w:t xml:space="preserve"> </w:t>
       </w:r>
       <w:r>
-        <w:t xml:space="preserve">Built the team’s environment and deployment tooling at Strategic Imperatives without being asked. I constantly automate my own ways of working and like to share those automations with the team; AI has been a godsend for that.</w:t>
+        <w:t xml:space="preserve">Built the team’s environment and deployment tooling at Strategic Imperatives unprompted; I share my automations with the team.</w:t>
       </w:r>
     </w:p>
     <w:bookmarkEnd w:id="24"/>
@@ -870,18 +870,6 @@
       </w:pPr>
       <w:r>
         <w:t xml:space="preserve">Software Engineering, Erasmus exchange semesters, Linköping University and Radboud University (2017)</w:t>
-      </w:r>
-    </w:p>
-    <w:p>
-      <w:pPr>
-        <w:pStyle w:val="Compact"/>
-        <w:numPr>
-          <w:ilvl w:val="0"/>
-          <w:numId w:val="1009"/>
-        </w:numPr>
-      </w:pPr>
-      <w:r>
-        <w:t xml:space="preserve">Coding Mentor, YMCA Paisley, Sep 2018 – Aug 2019. Taught coding to young people aged 7 to 18 in Paisley.</w:t>
       </w:r>
     </w:p>
     <w:bookmarkEnd w:id="25"/>

</xml_diff>